<commit_message>
Centra firmas, agrega lugar y fecha y subtítulos Integrantes/Asesores
Co-Authored-By: Claude Sonnet 5.5 <noreply@anthropic.com>
Claude-Session: https://claude.ai/code/session_01KPpPHVdUdRLpJSDry8SiLT
</commit_message>
<xml_diff>
--- a/Formato_TyC_Univ_GESHI-G.docx
+++ b/Formato_TyC_Univ_GESHI-G.docx
@@ -122,9 +122,9 @@
       <w:r>
         <w:rPr>
           <w:rStyle w:val="Ninguno"/>
-          <w:shd w:val="clear" w:color="auto" w:fill="FFFF00"/>
-        </w:rPr>
-        <w:t>________</w:t>
+          <w:lang w:val="es-ES_tradnl"/>
+        </w:rPr>
+        <w:t>Ixmiquilpan, Hidalgo, a 6 de octubre de 2026</w:t>
       </w:r>
     </w:p>
     <w:p>
@@ -1051,32 +1051,26 @@
     </w:p>
     <w:tbl>
       <w:tblPr>
-        <w:tblStyle w:val="TableNormal"/>
-        <w:tblW w:w="5000" w:type="pct"/>
-        <w:shd w:val="clear" w:color="auto" w:fill="CED7E7"/>
-        <w:tblLook w:val="04A0" w:firstRow="1" w:lastRow="0" w:firstColumn="1" w:lastColumn="0" w:noHBand="0" w:noVBand="1"/>
+        <w:tblW w:w="10548" w:type="dxa"/>
+        <w:jc w:val="center"/>
+        <w:tblLayout w:type="fixed"/>
       </w:tblPr>
       <w:tblGrid>
-        <w:gridCol w:w="3302"/>
-        <w:gridCol w:w="530"/>
-        <w:gridCol w:w="2939"/>
-        <w:gridCol w:w="747"/>
-        <w:gridCol w:w="3032"/>
+        <w:gridCol w:w="1758"/>
+        <w:gridCol w:w="1758"/>
+        <w:gridCol w:w="1758"/>
+        <w:gridCol w:w="1758"/>
+        <w:gridCol w:w="1758"/>
+        <w:gridCol w:w="1758"/>
       </w:tblGrid>
       <w:tr>
         <w:trPr>
-          <w:trHeight w:val="493"/>
+          <w:cantSplit/>
         </w:trPr>
         <w:tc>
           <w:tcPr>
-            <w:tcW w:w="1565" w:type="pct"/>
-            <w:shd w:val="clear" w:color="auto" w:fill="auto"/>
-            <w:tcMar>
-              <w:top w:w="80" w:type="dxa"/>
-              <w:left w:w="80" w:type="dxa"/>
-              <w:bottom w:w="80" w:type="dxa"/>
-              <w:right w:w="80" w:type="dxa"/>
-            </w:tcMar>
+            <w:tcW w:w="10548" w:type="dxa"/>
+            <w:gridSpan w:val="6"/>
           </w:tcPr>
           <w:p>
             <w:pPr>
@@ -1084,11 +1078,31 @@
               <w:spacing w:line="240" w:lineRule="auto"/>
               <w:jc w:val="center"/>
             </w:pPr>
+            <w:r>
+              <w:rPr>
+                <w:rStyle w:val="Ninguno"/>
+                <w:b/>
+                <w:lang w:val="es-ES_tradnl"/>
+              </w:rPr>
+              <w:t>Integrantes</w:t>
+            </w:r>
           </w:p>
+        </w:tc>
+      </w:tr>
+      <w:tr>
+        <w:trPr>
+          <w:cantSplit/>
+        </w:trPr>
+        <w:tc>
+          <w:tcPr>
+            <w:tcW w:w="3516" w:type="dxa"/>
+            <w:gridSpan w:val="2"/>
+          </w:tcPr>
           <w:p>
             <w:pPr>
               <w:pStyle w:val="Cuerpo"/>
               <w:spacing w:line="240" w:lineRule="auto"/>
+              <w:ind w:left="150" w:right="150"/>
               <w:jc w:val="center"/>
             </w:pPr>
           </w:p>
@@ -1096,6 +1110,15 @@
             <w:pPr>
               <w:pStyle w:val="Cuerpo"/>
               <w:spacing w:line="240" w:lineRule="auto"/>
+              <w:ind w:left="150" w:right="150"/>
+              <w:jc w:val="center"/>
+            </w:pPr>
+          </w:p>
+          <w:p>
+            <w:pPr>
+              <w:pStyle w:val="Cuerpo"/>
+              <w:spacing w:line="240" w:lineRule="auto"/>
+              <w:ind w:left="150" w:right="150"/>
               <w:jc w:val="center"/>
             </w:pPr>
           </w:p>
@@ -1106,6 +1129,7 @@
                 <w:top w:val="single" w:sz="4" w:space="1" w:color="auto"/>
               </w:pBdr>
               <w:spacing w:line="240" w:lineRule="auto"/>
+              <w:ind w:left="150" w:right="150"/>
               <w:jc w:val="center"/>
             </w:pPr>
             <w:r>
@@ -1117,24 +1141,114 @@
               <w:t>Carlos Didier Cecilio Alejandro</w:t>
             </w:r>
           </w:p>
+        </w:tc>
+        <w:tc>
+          <w:tcPr>
+            <w:tcW w:w="3516" w:type="dxa"/>
+            <w:gridSpan w:val="2"/>
+          </w:tcPr>
           <w:p>
             <w:pPr>
               <w:pStyle w:val="Cuerpo"/>
               <w:spacing w:line="240" w:lineRule="auto"/>
+              <w:ind w:left="150" w:right="150"/>
+              <w:jc w:val="center"/>
+            </w:pPr>
+          </w:p>
+          <w:p>
+            <w:pPr>
+              <w:pStyle w:val="Cuerpo"/>
+              <w:spacing w:line="240" w:lineRule="auto"/>
+              <w:ind w:left="150" w:right="150"/>
+              <w:jc w:val="center"/>
+            </w:pPr>
+          </w:p>
+          <w:p>
+            <w:pPr>
+              <w:pStyle w:val="Cuerpo"/>
+              <w:spacing w:line="240" w:lineRule="auto"/>
+              <w:ind w:left="150" w:right="150"/>
+              <w:jc w:val="center"/>
+            </w:pPr>
+          </w:p>
+          <w:p>
+            <w:pPr>
+              <w:pStyle w:val="Cuerpo"/>
+              <w:pBdr>
+                <w:top w:val="single" w:sz="4" w:space="1" w:color="auto"/>
+              </w:pBdr>
+              <w:spacing w:line="240" w:lineRule="auto"/>
+              <w:ind w:left="150" w:right="150"/>
               <w:jc w:val="center"/>
             </w:pPr>
             <w:r>
               <w:rPr>
                 <w:rStyle w:val="Ninguno"/>
+                <w:b/>
                 <w:lang w:val="es-ES_tradnl"/>
               </w:rPr>
-              <w:t>Integrante del equipo</w:t>
+              <w:t>Mayte Michelle Leyva Lopez</w:t>
             </w:r>
           </w:p>
         </w:tc>
         <w:tc>
           <w:tcPr>
-            <w:tcW w:w="251" w:type="pct"/>
+            <w:tcW w:w="3516" w:type="dxa"/>
+            <w:gridSpan w:val="2"/>
+          </w:tcPr>
+          <w:p>
+            <w:pPr>
+              <w:pStyle w:val="Cuerpo"/>
+              <w:spacing w:line="240" w:lineRule="auto"/>
+              <w:ind w:left="150" w:right="150"/>
+              <w:jc w:val="center"/>
+            </w:pPr>
+          </w:p>
+          <w:p>
+            <w:pPr>
+              <w:pStyle w:val="Cuerpo"/>
+              <w:spacing w:line="240" w:lineRule="auto"/>
+              <w:ind w:left="150" w:right="150"/>
+              <w:jc w:val="center"/>
+            </w:pPr>
+          </w:p>
+          <w:p>
+            <w:pPr>
+              <w:pStyle w:val="Cuerpo"/>
+              <w:spacing w:line="240" w:lineRule="auto"/>
+              <w:ind w:left="150" w:right="150"/>
+              <w:jc w:val="center"/>
+            </w:pPr>
+          </w:p>
+          <w:p>
+            <w:pPr>
+              <w:pStyle w:val="Cuerpo"/>
+              <w:pBdr>
+                <w:top w:val="single" w:sz="4" w:space="1" w:color="auto"/>
+              </w:pBdr>
+              <w:spacing w:line="240" w:lineRule="auto"/>
+              <w:ind w:left="150" w:right="150"/>
+              <w:jc w:val="center"/>
+            </w:pPr>
+            <w:r>
+              <w:rPr>
+                <w:rStyle w:val="Ninguno"/>
+                <w:b/>
+                <w:lang w:val="es-ES_tradnl"/>
+              </w:rPr>
+              <w:t>María Fernanda Paredes Flores</w:t>
+            </w:r>
+          </w:p>
+        </w:tc>
+      </w:tr>
+      <w:tr>
+        <w:trPr>
+          <w:cantSplit/>
+        </w:trPr>
+        <w:tc>
+          <w:tcPr>
+            <w:tcW w:w="1758" w:type="dxa"/>
+            <w:gridSpan w:val="1"/>
           </w:tcPr>
           <w:p>
             <w:pPr>
@@ -1146,19 +1260,14 @@
         </w:tc>
         <w:tc>
           <w:tcPr>
-            <w:tcW w:w="1393" w:type="pct"/>
-            <w:shd w:val="clear" w:color="auto" w:fill="auto"/>
-            <w:tcMar>
-              <w:top w:w="80" w:type="dxa"/>
-              <w:left w:w="80" w:type="dxa"/>
-              <w:bottom w:w="80" w:type="dxa"/>
-              <w:right w:w="80" w:type="dxa"/>
-            </w:tcMar>
+            <w:tcW w:w="3516" w:type="dxa"/>
+            <w:gridSpan w:val="2"/>
           </w:tcPr>
           <w:p>
             <w:pPr>
               <w:pStyle w:val="Cuerpo"/>
               <w:spacing w:line="240" w:lineRule="auto"/>
+              <w:ind w:left="150" w:right="150"/>
               <w:jc w:val="center"/>
             </w:pPr>
           </w:p>
@@ -1166,6 +1275,7 @@
             <w:pPr>
               <w:pStyle w:val="Cuerpo"/>
               <w:spacing w:line="240" w:lineRule="auto"/>
+              <w:ind w:left="150" w:right="150"/>
               <w:jc w:val="center"/>
             </w:pPr>
           </w:p>
@@ -1173,6 +1283,7 @@
             <w:pPr>
               <w:pStyle w:val="Cuerpo"/>
               <w:spacing w:line="240" w:lineRule="auto"/>
+              <w:ind w:left="150" w:right="150"/>
               <w:jc w:val="center"/>
             </w:pPr>
           </w:p>
@@ -1183,146 +1294,7 @@
                 <w:top w:val="single" w:sz="4" w:space="1" w:color="auto"/>
               </w:pBdr>
               <w:spacing w:line="240" w:lineRule="auto"/>
-              <w:jc w:val="center"/>
-            </w:pPr>
-            <w:r>
-              <w:rPr>
-                <w:rStyle w:val="Ninguno"/>
-                <w:b/>
-                <w:lang w:val="es-ES_tradnl"/>
-              </w:rPr>
-              <w:t>Mayte Michelle Leyva Lopez</w:t>
-            </w:r>
-          </w:p>
-          <w:p>
-            <w:pPr>
-              <w:pStyle w:val="Cuerpo"/>
-              <w:spacing w:line="240" w:lineRule="auto"/>
-              <w:jc w:val="center"/>
-            </w:pPr>
-            <w:r>
-              <w:rPr>
-                <w:rStyle w:val="Ninguno"/>
-                <w:lang w:val="es-ES_tradnl"/>
-              </w:rPr>
-              <w:t>Integrante del equipo</w:t>
-            </w:r>
-          </w:p>
-        </w:tc>
-        <w:tc>
-          <w:tcPr>
-            <w:tcW w:w="354" w:type="pct"/>
-          </w:tcPr>
-          <w:p>
-            <w:pPr>
-              <w:pStyle w:val="Cuerpo"/>
-              <w:spacing w:line="240" w:lineRule="auto"/>
-              <w:jc w:val="center"/>
-            </w:pPr>
-          </w:p>
-        </w:tc>
-        <w:tc>
-          <w:tcPr>
-            <w:tcW w:w="1437" w:type="pct"/>
-          </w:tcPr>
-          <w:p>
-            <w:pPr>
-              <w:pStyle w:val="Cuerpo"/>
-              <w:spacing w:line="240" w:lineRule="auto"/>
-              <w:jc w:val="center"/>
-            </w:pPr>
-          </w:p>
-          <w:p>
-            <w:pPr>
-              <w:pStyle w:val="Cuerpo"/>
-              <w:spacing w:line="240" w:lineRule="auto"/>
-              <w:jc w:val="center"/>
-            </w:pPr>
-          </w:p>
-          <w:p>
-            <w:pPr>
-              <w:pStyle w:val="Cuerpo"/>
-              <w:spacing w:line="240" w:lineRule="auto"/>
-              <w:jc w:val="center"/>
-            </w:pPr>
-          </w:p>
-          <w:p>
-            <w:pPr>
-              <w:pStyle w:val="Cuerpo"/>
-              <w:pBdr>
-                <w:top w:val="single" w:sz="4" w:space="1" w:color="auto"/>
-              </w:pBdr>
-              <w:spacing w:line="240" w:lineRule="auto"/>
-              <w:jc w:val="center"/>
-            </w:pPr>
-            <w:r>
-              <w:rPr>
-                <w:rStyle w:val="Ninguno"/>
-                <w:b/>
-                <w:lang w:val="es-ES_tradnl"/>
-              </w:rPr>
-              <w:t>María Fernanda Paredes Flores</w:t>
-            </w:r>
-          </w:p>
-          <w:p>
-            <w:pPr>
-              <w:pStyle w:val="Cuerpo"/>
-              <w:spacing w:line="240" w:lineRule="auto"/>
-              <w:jc w:val="center"/>
-            </w:pPr>
-            <w:r>
-              <w:rPr>
-                <w:rStyle w:val="Ninguno"/>
-                <w:lang w:val="es-ES_tradnl"/>
-              </w:rPr>
-              <w:t>Integrante del equipo</w:t>
-            </w:r>
-          </w:p>
-        </w:tc>
-      </w:tr>
-      <w:tr>
-        <w:trPr>
-          <w:trHeight w:val="20"/>
-        </w:trPr>
-        <w:tc>
-          <w:tcPr>
-            <w:tcW w:w="1565" w:type="pct"/>
-            <w:shd w:val="clear" w:color="auto" w:fill="auto"/>
-            <w:tcMar>
-              <w:top w:w="80" w:type="dxa"/>
-              <w:left w:w="80" w:type="dxa"/>
-              <w:bottom w:w="80" w:type="dxa"/>
-              <w:right w:w="80" w:type="dxa"/>
-            </w:tcMar>
-          </w:tcPr>
-          <w:p>
-            <w:pPr>
-              <w:pStyle w:val="Cuerpo"/>
-              <w:spacing w:line="240" w:lineRule="auto"/>
-              <w:jc w:val="center"/>
-            </w:pPr>
-          </w:p>
-          <w:p>
-            <w:pPr>
-              <w:pStyle w:val="Cuerpo"/>
-              <w:spacing w:line="240" w:lineRule="auto"/>
-              <w:jc w:val="center"/>
-            </w:pPr>
-          </w:p>
-          <w:p>
-            <w:pPr>
-              <w:pStyle w:val="Cuerpo"/>
-              <w:spacing w:line="240" w:lineRule="auto"/>
-              <w:jc w:val="center"/>
-            </w:pPr>
-          </w:p>
-          <w:p>
-            <w:pPr>
-              <w:pStyle w:val="Cuerpo"/>
-              <w:pBdr>
-                <w:top w:val="single" w:sz="4" w:space="1" w:color="auto"/>
-              </w:pBdr>
-              <w:spacing w:line="240" w:lineRule="auto"/>
+              <w:ind w:left="150" w:right="150"/>
               <w:jc w:val="center"/>
             </w:pPr>
             <w:r>
@@ -1334,48 +1306,17 @@
               <w:t>Octavio Medina Bañuelos</w:t>
             </w:r>
           </w:p>
-          <w:p>
-            <w:pPr>
-              <w:pStyle w:val="Cuerpo"/>
-              <w:spacing w:line="240" w:lineRule="auto"/>
-              <w:jc w:val="center"/>
-            </w:pPr>
-            <w:r>
-              <w:rPr>
-                <w:rStyle w:val="Ninguno"/>
-                <w:lang w:val="es-ES_tradnl"/>
-              </w:rPr>
-              <w:t>Integrante del equipo</w:t>
-            </w:r>
-          </w:p>
         </w:tc>
         <w:tc>
           <w:tcPr>
-            <w:tcW w:w="251" w:type="pct"/>
+            <w:tcW w:w="3516" w:type="dxa"/>
+            <w:gridSpan w:val="2"/>
           </w:tcPr>
           <w:p>
             <w:pPr>
               <w:pStyle w:val="Cuerpo"/>
               <w:spacing w:line="240" w:lineRule="auto"/>
-              <w:jc w:val="center"/>
-            </w:pPr>
-          </w:p>
-        </w:tc>
-        <w:tc>
-          <w:tcPr>
-            <w:tcW w:w="1393" w:type="pct"/>
-            <w:shd w:val="clear" w:color="auto" w:fill="auto"/>
-            <w:tcMar>
-              <w:top w:w="80" w:type="dxa"/>
-              <w:left w:w="80" w:type="dxa"/>
-              <w:bottom w:w="80" w:type="dxa"/>
-              <w:right w:w="80" w:type="dxa"/>
-            </w:tcMar>
-          </w:tcPr>
-          <w:p>
-            <w:pPr>
-              <w:pStyle w:val="Cuerpo"/>
-              <w:spacing w:line="240" w:lineRule="auto"/>
+              <w:ind w:left="150" w:right="150"/>
               <w:jc w:val="center"/>
             </w:pPr>
           </w:p>
@@ -1383,6 +1324,7 @@
             <w:pPr>
               <w:pStyle w:val="Cuerpo"/>
               <w:spacing w:line="240" w:lineRule="auto"/>
+              <w:ind w:left="150" w:right="150"/>
               <w:jc w:val="center"/>
             </w:pPr>
           </w:p>
@@ -1390,6 +1332,7 @@
             <w:pPr>
               <w:pStyle w:val="Cuerpo"/>
               <w:spacing w:line="240" w:lineRule="auto"/>
+              <w:ind w:left="150" w:right="150"/>
               <w:jc w:val="center"/>
             </w:pPr>
           </w:p>
@@ -1400,6 +1343,7 @@
                 <w:top w:val="single" w:sz="4" w:space="1" w:color="auto"/>
               </w:pBdr>
               <w:spacing w:line="240" w:lineRule="auto"/>
+              <w:ind w:left="150" w:right="150"/>
               <w:jc w:val="center"/>
             </w:pPr>
             <w:r>
@@ -1411,36 +1355,11 @@
               <w:t>Irvin Said Sánchez Salazar</w:t>
             </w:r>
           </w:p>
-          <w:p>
-            <w:pPr>
-              <w:pStyle w:val="Cuerpo"/>
-              <w:spacing w:line="240" w:lineRule="auto"/>
-              <w:jc w:val="center"/>
-            </w:pPr>
-            <w:r>
-              <w:rPr>
-                <w:rStyle w:val="Ninguno"/>
-                <w:lang w:val="es-ES_tradnl"/>
-              </w:rPr>
-              <w:t>Integrante del equipo</w:t>
-            </w:r>
-          </w:p>
         </w:tc>
         <w:tc>
           <w:tcPr>
-            <w:tcW w:w="354" w:type="pct"/>
-          </w:tcPr>
-          <w:p>
-            <w:pPr>
-              <w:pStyle w:val="Cuerpo"/>
-              <w:spacing w:line="240" w:lineRule="auto"/>
-              <w:jc w:val="center"/>
-            </w:pPr>
-          </w:p>
-        </w:tc>
-        <w:tc>
-          <w:tcPr>
-            <w:tcW w:w="1437" w:type="pct"/>
+            <w:tcW w:w="1758" w:type="dxa"/>
+            <w:gridSpan w:val="1"/>
           </w:tcPr>
           <w:p>
             <w:pPr>
@@ -1453,18 +1372,12 @@
       </w:tr>
       <w:tr>
         <w:trPr>
-          <w:trHeight w:val="20"/>
+          <w:cantSplit/>
         </w:trPr>
         <w:tc>
           <w:tcPr>
-            <w:tcW w:w="1565" w:type="pct"/>
-            <w:shd w:val="clear" w:color="auto" w:fill="auto"/>
-            <w:tcMar>
-              <w:top w:w="80" w:type="dxa"/>
-              <w:left w:w="80" w:type="dxa"/>
-              <w:bottom w:w="80" w:type="dxa"/>
-              <w:right w:w="80" w:type="dxa"/>
-            </w:tcMar>
+            <w:tcW w:w="10548" w:type="dxa"/>
+            <w:gridSpan w:val="6"/>
           </w:tcPr>
           <w:p>
             <w:pPr>
@@ -1473,6 +1386,43 @@
               <w:jc w:val="center"/>
             </w:pPr>
           </w:p>
+        </w:tc>
+      </w:tr>
+      <w:tr>
+        <w:trPr>
+          <w:cantSplit/>
+        </w:trPr>
+        <w:tc>
+          <w:tcPr>
+            <w:tcW w:w="10548" w:type="dxa"/>
+            <w:gridSpan w:val="6"/>
+          </w:tcPr>
+          <w:p>
+            <w:pPr>
+              <w:pStyle w:val="Cuerpo"/>
+              <w:spacing w:line="240" w:lineRule="auto"/>
+              <w:jc w:val="center"/>
+            </w:pPr>
+            <w:r>
+              <w:rPr>
+                <w:rStyle w:val="Ninguno"/>
+                <w:b/>
+                <w:lang w:val="es-ES_tradnl"/>
+              </w:rPr>
+              <w:t>Asesores</w:t>
+            </w:r>
+          </w:p>
+        </w:tc>
+      </w:tr>
+      <w:tr>
+        <w:trPr>
+          <w:cantSplit/>
+        </w:trPr>
+        <w:tc>
+          <w:tcPr>
+            <w:tcW w:w="1758" w:type="dxa"/>
+            <w:gridSpan w:val="1"/>
+          </w:tcPr>
           <w:p>
             <w:pPr>
               <w:pStyle w:val="Cuerpo"/>
@@ -1480,10 +1430,33 @@
               <w:jc w:val="center"/>
             </w:pPr>
           </w:p>
+        </w:tc>
+        <w:tc>
+          <w:tcPr>
+            <w:tcW w:w="3516" w:type="dxa"/>
+            <w:gridSpan w:val="2"/>
+          </w:tcPr>
           <w:p>
             <w:pPr>
               <w:pStyle w:val="Cuerpo"/>
               <w:spacing w:line="240" w:lineRule="auto"/>
+              <w:ind w:left="150" w:right="150"/>
+              <w:jc w:val="center"/>
+            </w:pPr>
+          </w:p>
+          <w:p>
+            <w:pPr>
+              <w:pStyle w:val="Cuerpo"/>
+              <w:spacing w:line="240" w:lineRule="auto"/>
+              <w:ind w:left="150" w:right="150"/>
+              <w:jc w:val="center"/>
+            </w:pPr>
+          </w:p>
+          <w:p>
+            <w:pPr>
+              <w:pStyle w:val="Cuerpo"/>
+              <w:spacing w:line="240" w:lineRule="auto"/>
+              <w:ind w:left="150" w:right="150"/>
               <w:jc w:val="center"/>
             </w:pPr>
           </w:p>
@@ -1494,6 +1467,7 @@
                 <w:top w:val="single" w:sz="4" w:space="1" w:color="auto"/>
               </w:pBdr>
               <w:spacing w:line="240" w:lineRule="auto"/>
+              <w:ind w:left="150" w:right="150"/>
               <w:jc w:val="center"/>
             </w:pPr>
             <w:r>
@@ -1505,48 +1479,17 @@
               <w:t>M.I. Christian Hernández Santiago</w:t>
             </w:r>
           </w:p>
-          <w:p>
-            <w:pPr>
-              <w:pStyle w:val="Cuerpo"/>
-              <w:spacing w:line="240" w:lineRule="auto"/>
-              <w:jc w:val="center"/>
-            </w:pPr>
-            <w:r>
-              <w:rPr>
-                <w:rStyle w:val="Ninguno"/>
-                <w:lang w:val="es-ES_tradnl"/>
-              </w:rPr>
-              <w:t>Asesor</w:t>
-            </w:r>
-          </w:p>
         </w:tc>
         <w:tc>
           <w:tcPr>
-            <w:tcW w:w="251" w:type="pct"/>
+            <w:tcW w:w="3516" w:type="dxa"/>
+            <w:gridSpan w:val="2"/>
           </w:tcPr>
           <w:p>
             <w:pPr>
               <w:pStyle w:val="Cuerpo"/>
               <w:spacing w:line="240" w:lineRule="auto"/>
-              <w:jc w:val="center"/>
-            </w:pPr>
-          </w:p>
-        </w:tc>
-        <w:tc>
-          <w:tcPr>
-            <w:tcW w:w="1393" w:type="pct"/>
-            <w:shd w:val="clear" w:color="auto" w:fill="auto"/>
-            <w:tcMar>
-              <w:top w:w="80" w:type="dxa"/>
-              <w:left w:w="80" w:type="dxa"/>
-              <w:bottom w:w="80" w:type="dxa"/>
-              <w:right w:w="80" w:type="dxa"/>
-            </w:tcMar>
-          </w:tcPr>
-          <w:p>
-            <w:pPr>
-              <w:pStyle w:val="Cuerpo"/>
-              <w:spacing w:line="240" w:lineRule="auto"/>
+              <w:ind w:left="150" w:right="150"/>
               <w:jc w:val="center"/>
             </w:pPr>
           </w:p>
@@ -1554,6 +1497,7 @@
             <w:pPr>
               <w:pStyle w:val="Cuerpo"/>
               <w:spacing w:line="240" w:lineRule="auto"/>
+              <w:ind w:left="150" w:right="150"/>
               <w:jc w:val="center"/>
             </w:pPr>
           </w:p>
@@ -1561,6 +1505,7 @@
             <w:pPr>
               <w:pStyle w:val="Cuerpo"/>
               <w:spacing w:line="240" w:lineRule="auto"/>
+              <w:ind w:left="150" w:right="150"/>
               <w:jc w:val="center"/>
             </w:pPr>
           </w:p>
@@ -1571,6 +1516,7 @@
                 <w:top w:val="single" w:sz="4" w:space="1" w:color="auto"/>
               </w:pBdr>
               <w:spacing w:line="240" w:lineRule="auto"/>
+              <w:ind w:left="150" w:right="150"/>
               <w:jc w:val="center"/>
             </w:pPr>
             <w:r>
@@ -1582,36 +1528,11 @@
               <w:t>Ing. Francisco Alejandro Arroyo Carrasco</w:t>
             </w:r>
           </w:p>
-          <w:p>
-            <w:pPr>
-              <w:pStyle w:val="Cuerpo"/>
-              <w:spacing w:line="240" w:lineRule="auto"/>
-              <w:jc w:val="center"/>
-            </w:pPr>
-            <w:r>
-              <w:rPr>
-                <w:rStyle w:val="Ninguno"/>
-                <w:lang w:val="es-ES_tradnl"/>
-              </w:rPr>
-              <w:t>Asesor</w:t>
-            </w:r>
-          </w:p>
         </w:tc>
         <w:tc>
           <w:tcPr>
-            <w:tcW w:w="354" w:type="pct"/>
-          </w:tcPr>
-          <w:p>
-            <w:pPr>
-              <w:pStyle w:val="Cuerpo"/>
-              <w:spacing w:line="240" w:lineRule="auto"/>
-              <w:jc w:val="center"/>
-            </w:pPr>
-          </w:p>
-        </w:tc>
-        <w:tc>
-          <w:tcPr>
-            <w:tcW w:w="1437" w:type="pct"/>
+            <w:tcW w:w="1758" w:type="dxa"/>
+            <w:gridSpan w:val="1"/>
           </w:tcPr>
           <w:p>
             <w:pPr>
@@ -1622,7 +1543,6 @@
           </w:p>
         </w:tc>
       </w:tr>
-      <w:bookmarkEnd w:id="1"/>
     </w:tbl>
     <w:p>
       <w:pPr>

</xml_diff>